<commit_message>
[DOCS] Plan + Intro overwrite
</commit_message>
<xml_diff>
--- a/documents/Plan_tematic_licenta_Maior_v2.docx
+++ b/documents/Plan_tematic_licenta_Maior_v2.docx
@@ -259,14 +259,46 @@
           <w:rFonts w:ascii="Times New Roman" w:hAnsi="Times New Roman" w:cs="Times New Roman"/>
           <w:color w:val="auto"/>
         </w:rPr>
-        <w:t>Predicția defectelor și mecanisme de auto-recuperare în arhitecturi Software-Defined Vehicle, la nivel de ECU</w:t>
-      </w:r>
-      <w:bookmarkEnd w:id="0"/>
+        <w:t>Predicția defectelor și mecanisme de auto-recuperare în arhitecturi Software-</w:t>
+      </w:r>
+      <w:proofErr w:type="spellStart"/>
       <w:r>
         <w:rPr>
           <w:rFonts w:ascii="Times New Roman" w:hAnsi="Times New Roman" w:cs="Times New Roman"/>
           <w:color w:val="auto"/>
         </w:rPr>
+        <w:t>Defined</w:t>
+      </w:r>
+      <w:proofErr w:type="spellEnd"/>
+      <w:r>
+        <w:rPr>
+          <w:rFonts w:ascii="Times New Roman" w:hAnsi="Times New Roman" w:cs="Times New Roman"/>
+          <w:color w:val="auto"/>
+        </w:rPr>
+        <w:t xml:space="preserve"> </w:t>
+      </w:r>
+      <w:proofErr w:type="spellStart"/>
+      <w:r>
+        <w:rPr>
+          <w:rFonts w:ascii="Times New Roman" w:hAnsi="Times New Roman" w:cs="Times New Roman"/>
+          <w:color w:val="auto"/>
+        </w:rPr>
+        <w:t>Vehicle</w:t>
+      </w:r>
+      <w:proofErr w:type="spellEnd"/>
+      <w:r>
+        <w:rPr>
+          <w:rFonts w:ascii="Times New Roman" w:hAnsi="Times New Roman" w:cs="Times New Roman"/>
+          <w:color w:val="auto"/>
+        </w:rPr>
+        <w:t>, la nivel de ECU</w:t>
+      </w:r>
+      <w:bookmarkEnd w:id="0"/>
+      <w:r>
+        <w:rPr>
+          <w:rFonts w:ascii="Times New Roman" w:hAnsi="Times New Roman" w:cs="Times New Roman"/>
+          <w:color w:val="auto"/>
+        </w:rPr>
         <w:t>.</w:t>
       </w:r>
     </w:p>
@@ -368,6 +400,7 @@
       <w:r>
         <w:t xml:space="preserve"> </w:t>
       </w:r>
+      <w:proofErr w:type="spellStart"/>
       <w:r>
         <w:rPr>
           <w:b/>
@@ -375,9 +408,11 @@
         </w:rPr>
         <w:t>Renode</w:t>
       </w:r>
+      <w:proofErr w:type="spellEnd"/>
       <w:r>
         <w:t xml:space="preserve"> pentru dezvoltare independentă de plăcile fizice. Antrenarea modelelor se face în </w:t>
       </w:r>
+      <w:proofErr w:type="spellStart"/>
       <w:r>
         <w:rPr>
           <w:b/>
@@ -385,8 +420,41 @@
         </w:rPr>
         <w:t>Python</w:t>
       </w:r>
-      <w:r>
-        <w:t xml:space="preserve"> (PyTorch, PyTorch Geometric, scikit-learn), firmware-ul în </w:t>
+      <w:proofErr w:type="spellEnd"/>
+      <w:r>
+        <w:t xml:space="preserve"> (</w:t>
+      </w:r>
+      <w:proofErr w:type="spellStart"/>
+      <w:r>
+        <w:t>PyTorch</w:t>
+      </w:r>
+      <w:proofErr w:type="spellEnd"/>
+      <w:r>
+        <w:t xml:space="preserve">, </w:t>
+      </w:r>
+      <w:proofErr w:type="spellStart"/>
+      <w:r>
+        <w:t>PyTorch</w:t>
+      </w:r>
+      <w:proofErr w:type="spellEnd"/>
+      <w:r>
+        <w:t xml:space="preserve"> Geometric, </w:t>
+      </w:r>
+      <w:proofErr w:type="spellStart"/>
+      <w:r>
+        <w:t>scikit-learn</w:t>
+      </w:r>
+      <w:proofErr w:type="spellEnd"/>
+      <w:r>
+        <w:t xml:space="preserve">), </w:t>
+      </w:r>
+      <w:proofErr w:type="spellStart"/>
+      <w:r>
+        <w:t>firmware-ul</w:t>
+      </w:r>
+      <w:proofErr w:type="spellEnd"/>
+      <w:r>
+        <w:t xml:space="preserve"> în </w:t>
       </w:r>
       <w:r>
         <w:rPr>
@@ -396,15 +464,41 @@
         <w:t>C</w:t>
       </w:r>
       <w:r>
-        <w:t xml:space="preserve">; portarea pe MCU prin </w:t>
-      </w:r>
-      <w:r>
-        <w:rPr>
-          <w:b/>
-          <w:bCs/>
-        </w:rPr>
-        <w:t>LiteRT for Microcontrollers</w:t>
-      </w:r>
+        <w:t xml:space="preserve">; </w:t>
+      </w:r>
+      <w:proofErr w:type="spellStart"/>
+      <w:r>
+        <w:t>portarea</w:t>
+      </w:r>
+      <w:proofErr w:type="spellEnd"/>
+      <w:r>
+        <w:t xml:space="preserve"> pe MCU prin </w:t>
+      </w:r>
+      <w:proofErr w:type="spellStart"/>
+      <w:r>
+        <w:rPr>
+          <w:b/>
+          <w:bCs/>
+        </w:rPr>
+        <w:t>LiteRT</w:t>
+      </w:r>
+      <w:proofErr w:type="spellEnd"/>
+      <w:r>
+        <w:rPr>
+          <w:b/>
+          <w:bCs/>
+        </w:rPr>
+        <w:t xml:space="preserve"> for </w:t>
+      </w:r>
+      <w:proofErr w:type="spellStart"/>
+      <w:r>
+        <w:rPr>
+          <w:b/>
+          <w:bCs/>
+        </w:rPr>
+        <w:t>Microcontrollers</w:t>
+      </w:r>
+      <w:proofErr w:type="spellEnd"/>
       <w:r>
         <w:t xml:space="preserve"> și </w:t>
       </w:r>
@@ -413,11 +507,29 @@
           <w:b/>
           <w:bCs/>
         </w:rPr>
-        <w:t>NXP eIQ</w:t>
-      </w:r>
-      <w:r>
-        <w:t xml:space="preserve">, cuantizat int8. Deployment </w:t>
-      </w:r>
+        <w:t xml:space="preserve">NXP </w:t>
+      </w:r>
+      <w:proofErr w:type="spellStart"/>
+      <w:r>
+        <w:rPr>
+          <w:b/>
+          <w:bCs/>
+        </w:rPr>
+        <w:t>eIQ</w:t>
+      </w:r>
+      <w:proofErr w:type="spellEnd"/>
+      <w:r>
+        <w:t xml:space="preserve">, cuantizat int8. </w:t>
+      </w:r>
+      <w:proofErr w:type="spellStart"/>
+      <w:r>
+        <w:t>Deployment</w:t>
+      </w:r>
+      <w:proofErr w:type="spellEnd"/>
+      <w:r>
+        <w:t xml:space="preserve"> </w:t>
+      </w:r>
+      <w:proofErr w:type="spellStart"/>
       <w:r>
         <w:rPr>
           <w:b/>
@@ -425,8 +537,57 @@
         </w:rPr>
         <w:t>Railway</w:t>
       </w:r>
-      <w:r>
-        <w:t xml:space="preserve"> (EU-West, GDPR): MQTT, Redpanda, InfluxDB, PostgreSQL/pgvector, FastAPI, Grafana.</w:t>
+      <w:proofErr w:type="spellEnd"/>
+      <w:r>
+        <w:t xml:space="preserve"> (EU-West, GDPR): MQTT, </w:t>
+      </w:r>
+      <w:proofErr w:type="spellStart"/>
+      <w:r>
+        <w:t>Redpanda</w:t>
+      </w:r>
+      <w:proofErr w:type="spellEnd"/>
+      <w:r>
+        <w:t xml:space="preserve">, </w:t>
+      </w:r>
+      <w:proofErr w:type="spellStart"/>
+      <w:r>
+        <w:t>InfluxDB</w:t>
+      </w:r>
+      <w:proofErr w:type="spellEnd"/>
+      <w:r>
+        <w:t xml:space="preserve">, </w:t>
+      </w:r>
+      <w:proofErr w:type="spellStart"/>
+      <w:r>
+        <w:t>PostgreSQL</w:t>
+      </w:r>
+      <w:proofErr w:type="spellEnd"/>
+      <w:r>
+        <w:t>/</w:t>
+      </w:r>
+      <w:proofErr w:type="spellStart"/>
+      <w:r>
+        <w:t>pgvector</w:t>
+      </w:r>
+      <w:proofErr w:type="spellEnd"/>
+      <w:r>
+        <w:t xml:space="preserve">, </w:t>
+      </w:r>
+      <w:proofErr w:type="spellStart"/>
+      <w:r>
+        <w:t>FastAPI</w:t>
+      </w:r>
+      <w:proofErr w:type="spellEnd"/>
+      <w:r>
+        <w:t xml:space="preserve">, </w:t>
+      </w:r>
+      <w:proofErr w:type="spellStart"/>
+      <w:r>
+        <w:t>Grafana</w:t>
+      </w:r>
+      <w:proofErr w:type="spellEnd"/>
+      <w:r>
+        <w:t>.</w:t>
       </w:r>
     </w:p>
     <w:p>
@@ -471,7 +632,21 @@
         <w:rPr>
           <w:lang w:val="ro-RO"/>
         </w:rPr>
-        <w:t>clasă, semnal, mod de injecție, tip de claim (predicție / detecție) și acțiune de recuperare.</w:t>
+        <w:t xml:space="preserve">clasă, semnal, mod de injecție, tip de </w:t>
+      </w:r>
+      <w:proofErr w:type="spellStart"/>
+      <w:r>
+        <w:rPr>
+          <w:lang w:val="ro-RO"/>
+        </w:rPr>
+        <w:t>claim</w:t>
+      </w:r>
+      <w:proofErr w:type="spellEnd"/>
+      <w:r>
+        <w:rPr>
+          <w:lang w:val="ro-RO"/>
+        </w:rPr>
+        <w:t xml:space="preserve"> (predicție / detecție) și acțiune de recuperare.</w:t>
       </w:r>
     </w:p>
     <w:p>
@@ -499,7 +674,33 @@
         <w:rPr>
           <w:lang w:val="ro-RO"/>
         </w:rPr>
-        <w:t>Rețea S32K1–S32K3 emulată în Renode plus scripturi care injectează și etichetează automat defecte, generând un set de date propriu de telemetrie — răspunsul direct la lipsa datelor reale de defect software.</w:t>
+        <w:t xml:space="preserve">Rețea S32K1–S32K3 emulată în </w:t>
+      </w:r>
+      <w:proofErr w:type="spellStart"/>
+      <w:r>
+        <w:rPr>
+          <w:lang w:val="ro-RO"/>
+        </w:rPr>
+        <w:t>Renode</w:t>
+      </w:r>
+      <w:proofErr w:type="spellEnd"/>
+      <w:r>
+        <w:rPr>
+          <w:lang w:val="ro-RO"/>
+        </w:rPr>
+        <w:t xml:space="preserve"> plus scripturi care injectează și etichetează automat defecte, generând un set de date propriu de telemetrie </w:t>
+      </w:r>
+      <w:r>
+        <w:rPr>
+          <w:lang w:val="ro-RO"/>
+        </w:rPr>
+        <w:t>-</w:t>
+      </w:r>
+      <w:r>
+        <w:rPr>
+          <w:lang w:val="ro-RO"/>
+        </w:rPr>
+        <w:t xml:space="preserve"> răspunsul direct la lipsa datelor reale de defect software.</w:t>
       </w:r>
     </w:p>
     <w:p>
@@ -527,7 +728,21 @@
         <w:rPr>
           <w:lang w:val="ro-RO"/>
         </w:rPr>
-        <w:t>Nu doar detecție, ci estimarea timpului rămas până la cădere: pentru epuizarea memoriei, din ritmul de creștere a heap-ului (cât de repede scade memoria liberă); pentru intrarea CAN în bus-off, din contoarele de erori TEC/REC (praguri 127 și 256). Ambele au un reper analitic exact, deci eroarea de predicție se măsoară precis.</w:t>
+        <w:t xml:space="preserve">Nu doar detecție, ci estimarea timpului rămas până la cădere: pentru epuizarea memoriei, din ritmul de creștere a </w:t>
+      </w:r>
+      <w:proofErr w:type="spellStart"/>
+      <w:r>
+        <w:rPr>
+          <w:lang w:val="ro-RO"/>
+        </w:rPr>
+        <w:t>heap</w:t>
+      </w:r>
+      <w:proofErr w:type="spellEnd"/>
+      <w:r>
+        <w:rPr>
+          <w:lang w:val="ro-RO"/>
+        </w:rPr>
+        <w:t>-ului (cât de repede scade memoria liberă); pentru intrarea CAN în bus-off, din contoarele de erori TEC/REC (praguri 127 și 256). Ambele au un reper analitic exact, deci eroarea de predicție se măsoară precis.</w:t>
       </w:r>
     </w:p>
     <w:p>
@@ -555,7 +770,61 @@
         <w:rPr>
           <w:lang w:val="ro-RO"/>
         </w:rPr>
-        <w:t>Ratarea unui deadline din varianța timpului de răspuns (avertizare timpurie) și anomalie acustică — autoencoder int8 pe caracteristici FFT din microfon, rulat pe nucleul AI al S32K3 via LiteRT, pre-validat pe date publice MIMII.</w:t>
+        <w:t xml:space="preserve">Ratarea unui </w:t>
+      </w:r>
+      <w:proofErr w:type="spellStart"/>
+      <w:r>
+        <w:rPr>
+          <w:lang w:val="ro-RO"/>
+        </w:rPr>
+        <w:t>deadline</w:t>
+      </w:r>
+      <w:proofErr w:type="spellEnd"/>
+      <w:r>
+        <w:rPr>
+          <w:lang w:val="ro-RO"/>
+        </w:rPr>
+        <w:t xml:space="preserve"> din varianța timpului de răspuns (avertizare timpurie) și anomalie acustică </w:t>
+      </w:r>
+      <w:r>
+        <w:rPr>
+          <w:lang w:val="ro-RO"/>
+        </w:rPr>
+        <w:t>-</w:t>
+      </w:r>
+      <w:r>
+        <w:rPr>
+          <w:lang w:val="ro-RO"/>
+        </w:rPr>
+        <w:t xml:space="preserve"> </w:t>
+      </w:r>
+      <w:proofErr w:type="spellStart"/>
+      <w:r>
+        <w:rPr>
+          <w:lang w:val="ro-RO"/>
+        </w:rPr>
+        <w:t>autoencoder</w:t>
+      </w:r>
+      <w:proofErr w:type="spellEnd"/>
+      <w:r>
+        <w:rPr>
+          <w:lang w:val="ro-RO"/>
+        </w:rPr>
+        <w:t xml:space="preserve"> int8 pe caracteristici FFT din microfon, rulat pe nucleul AI al S32K3 via </w:t>
+      </w:r>
+      <w:proofErr w:type="spellStart"/>
+      <w:r>
+        <w:rPr>
+          <w:lang w:val="ro-RO"/>
+        </w:rPr>
+        <w:t>LiteRT</w:t>
+      </w:r>
+      <w:proofErr w:type="spellEnd"/>
+      <w:r>
+        <w:rPr>
+          <w:lang w:val="ro-RO"/>
+        </w:rPr>
+        <w:t>, pre-validat pe date publice MIMII.</w:t>
       </w:r>
     </w:p>
     <w:p>
@@ -610,14 +879,98 @@
           <w:color w:val="auto"/>
           <w:lang w:val="ro-RO"/>
         </w:rPr>
-        <w:t xml:space="preserve">Predicția propagării cross-ECU (GNN). </w:t>
-      </w:r>
-      <w:r>
-        <w:rPr>
+        <w:t xml:space="preserve">Predicția propagării </w:t>
+      </w:r>
+      <w:proofErr w:type="spellStart"/>
+      <w:r>
+        <w:rPr>
+          <w:b/>
+          <w:bCs/>
           <w:color w:val="auto"/>
           <w:lang w:val="ro-RO"/>
         </w:rPr>
-        <w:t>Un Graph Neural Network în cloud estimează calea de propagare pe graful de dependențe. Doar propune, nu comandă: cloud-ul propune, S32K3 decide.</w:t>
+        <w:t>cross</w:t>
+      </w:r>
+      <w:proofErr w:type="spellEnd"/>
+      <w:r>
+        <w:rPr>
+          <w:b/>
+          <w:bCs/>
+          <w:color w:val="auto"/>
+          <w:lang w:val="ro-RO"/>
+        </w:rPr>
+        <w:t xml:space="preserve">-ECU (GNN). </w:t>
+      </w:r>
+      <w:r>
+        <w:rPr>
+          <w:color w:val="auto"/>
+          <w:lang w:val="ro-RO"/>
+        </w:rPr>
+        <w:t xml:space="preserve">Un </w:t>
+      </w:r>
+      <w:proofErr w:type="spellStart"/>
+      <w:r>
+        <w:rPr>
+          <w:color w:val="auto"/>
+          <w:lang w:val="ro-RO"/>
+        </w:rPr>
+        <w:t>Graph</w:t>
+      </w:r>
+      <w:proofErr w:type="spellEnd"/>
+      <w:r>
+        <w:rPr>
+          <w:color w:val="auto"/>
+          <w:lang w:val="ro-RO"/>
+        </w:rPr>
+        <w:t xml:space="preserve"> Neural </w:t>
+      </w:r>
+      <w:proofErr w:type="spellStart"/>
+      <w:r>
+        <w:rPr>
+          <w:color w:val="auto"/>
+          <w:lang w:val="ro-RO"/>
+        </w:rPr>
+        <w:t>Network</w:t>
+      </w:r>
+      <w:proofErr w:type="spellEnd"/>
+      <w:r>
+        <w:rPr>
+          <w:color w:val="auto"/>
+          <w:lang w:val="ro-RO"/>
+        </w:rPr>
+        <w:t xml:space="preserve"> în </w:t>
+      </w:r>
+      <w:proofErr w:type="spellStart"/>
+      <w:r>
+        <w:rPr>
+          <w:color w:val="auto"/>
+          <w:lang w:val="ro-RO"/>
+        </w:rPr>
+        <w:t>cloud</w:t>
+      </w:r>
+      <w:proofErr w:type="spellEnd"/>
+      <w:r>
+        <w:rPr>
+          <w:color w:val="auto"/>
+          <w:lang w:val="ro-RO"/>
+        </w:rPr>
+        <w:t xml:space="preserve"> estimează calea de propagare pe graful de dependențe. Doar propune, nu comandă: </w:t>
+      </w:r>
+      <w:proofErr w:type="spellStart"/>
+      <w:r>
+        <w:rPr>
+          <w:color w:val="auto"/>
+          <w:lang w:val="ro-RO"/>
+        </w:rPr>
+        <w:t>cloud-ul</w:t>
+      </w:r>
+      <w:proofErr w:type="spellEnd"/>
+      <w:r>
+        <w:rPr>
+          <w:color w:val="auto"/>
+          <w:lang w:val="ro-RO"/>
+        </w:rPr>
+        <w:t xml:space="preserve"> propune, S32K3 decide.</w:t>
       </w:r>
     </w:p>
     <w:p>
@@ -669,19 +1022,127 @@
           <w:lang w:val="ro-RO"/>
         </w:rPr>
       </w:pPr>
-      <w:r>
-        <w:rPr>
-          <w:b/>
-          <w:bCs/>
-          <w:lang w:val="ro-RO"/>
-        </w:rPr>
-        <w:t xml:space="preserve">Backbone de date și tablou de bord. </w:t>
-      </w:r>
-      <w:r>
-        <w:rPr>
-          <w:lang w:val="ro-RO"/>
-        </w:rPr>
-        <w:t>Telemetrie MQTT preluată prin Redpanda, stocată în InfluxDB, servită de FastAPI, pe Railway (EU-West, GDPR); vizualizare în Grafana și panou React cu operator uman; istoric în pgvector și reantrenare cu redistribuire OTA a modelului.</w:t>
+      <w:proofErr w:type="spellStart"/>
+      <w:r>
+        <w:rPr>
+          <w:b/>
+          <w:bCs/>
+          <w:lang w:val="ro-RO"/>
+        </w:rPr>
+        <w:t>Backbone</w:t>
+      </w:r>
+      <w:proofErr w:type="spellEnd"/>
+      <w:r>
+        <w:rPr>
+          <w:b/>
+          <w:bCs/>
+          <w:lang w:val="ro-RO"/>
+        </w:rPr>
+        <w:t xml:space="preserve"> de date și tablou de bord. </w:t>
+      </w:r>
+      <w:r>
+        <w:rPr>
+          <w:lang w:val="ro-RO"/>
+        </w:rPr>
+        <w:t xml:space="preserve">Telemetrie MQTT preluată prin </w:t>
+      </w:r>
+      <w:proofErr w:type="spellStart"/>
+      <w:r>
+        <w:rPr>
+          <w:lang w:val="ro-RO"/>
+        </w:rPr>
+        <w:t>Redpanda</w:t>
+      </w:r>
+      <w:proofErr w:type="spellEnd"/>
+      <w:r>
+        <w:rPr>
+          <w:lang w:val="ro-RO"/>
+        </w:rPr>
+        <w:t xml:space="preserve">, stocată în </w:t>
+      </w:r>
+      <w:proofErr w:type="spellStart"/>
+      <w:r>
+        <w:rPr>
+          <w:lang w:val="ro-RO"/>
+        </w:rPr>
+        <w:t>InfluxDB</w:t>
+      </w:r>
+      <w:proofErr w:type="spellEnd"/>
+      <w:r>
+        <w:rPr>
+          <w:lang w:val="ro-RO"/>
+        </w:rPr>
+        <w:t xml:space="preserve">, servită de </w:t>
+      </w:r>
+      <w:proofErr w:type="spellStart"/>
+      <w:r>
+        <w:rPr>
+          <w:lang w:val="ro-RO"/>
+        </w:rPr>
+        <w:t>FastAPI</w:t>
+      </w:r>
+      <w:proofErr w:type="spellEnd"/>
+      <w:r>
+        <w:rPr>
+          <w:lang w:val="ro-RO"/>
+        </w:rPr>
+        <w:t xml:space="preserve">, pe </w:t>
+      </w:r>
+      <w:proofErr w:type="spellStart"/>
+      <w:r>
+        <w:rPr>
+          <w:lang w:val="ro-RO"/>
+        </w:rPr>
+        <w:t>Railway</w:t>
+      </w:r>
+      <w:proofErr w:type="spellEnd"/>
+      <w:r>
+        <w:rPr>
+          <w:lang w:val="ro-RO"/>
+        </w:rPr>
+        <w:t xml:space="preserve"> (EU-West, GDPR); vizualizare în </w:t>
+      </w:r>
+      <w:proofErr w:type="spellStart"/>
+      <w:r>
+        <w:rPr>
+          <w:lang w:val="ro-RO"/>
+        </w:rPr>
+        <w:t>Grafana</w:t>
+      </w:r>
+      <w:proofErr w:type="spellEnd"/>
+      <w:r>
+        <w:rPr>
+          <w:lang w:val="ro-RO"/>
+        </w:rPr>
+        <w:t xml:space="preserve"> și panou </w:t>
+      </w:r>
+      <w:proofErr w:type="spellStart"/>
+      <w:r>
+        <w:rPr>
+          <w:lang w:val="ro-RO"/>
+        </w:rPr>
+        <w:t>React</w:t>
+      </w:r>
+      <w:proofErr w:type="spellEnd"/>
+      <w:r>
+        <w:rPr>
+          <w:lang w:val="ro-RO"/>
+        </w:rPr>
+        <w:t xml:space="preserve"> cu operator uman; istoric în </w:t>
+      </w:r>
+      <w:proofErr w:type="spellStart"/>
+      <w:r>
+        <w:rPr>
+          <w:lang w:val="ro-RO"/>
+        </w:rPr>
+        <w:t>pgvector</w:t>
+      </w:r>
+      <w:proofErr w:type="spellEnd"/>
+      <w:r>
+        <w:rPr>
+          <w:lang w:val="ro-RO"/>
+        </w:rPr>
+        <w:t xml:space="preserve"> și reantrenare cu redistribuire OTA a modelului.</w:t>
       </w:r>
     </w:p>
     <w:p>
@@ -739,7 +1200,21 @@
         <w:rPr>
           <w:lang w:val="ro-RO"/>
         </w:rPr>
-        <w:t>vehicul-cloud-inginer: telemetrie, OTA și operator uman.</w:t>
+        <w:t>vehicul-</w:t>
+      </w:r>
+      <w:proofErr w:type="spellStart"/>
+      <w:r>
+        <w:rPr>
+          <w:lang w:val="ro-RO"/>
+        </w:rPr>
+        <w:t>cloud</w:t>
+      </w:r>
+      <w:proofErr w:type="spellEnd"/>
+      <w:r>
+        <w:rPr>
+          <w:lang w:val="ro-RO"/>
+        </w:rPr>
+        <w:t>-inginer: telemetrie, OTA și operator uman.</w:t>
       </w:r>
     </w:p>
     <w:p>
@@ -759,13 +1234,43 @@
           <w:bCs/>
           <w:lang w:val="ro-RO"/>
         </w:rPr>
-        <w:t xml:space="preserve">Bucla real-time pe S32K3: </w:t>
-      </w:r>
-      <w:r>
-        <w:rPr>
-          <w:lang w:val="ro-RO"/>
-        </w:rPr>
-        <w:t>SENSE-DETECT-PREDICT-SUPERVIZOR-ACT, cu supervizorul determinist ca poartă de veto.</w:t>
+        <w:t>Bucla real-</w:t>
+      </w:r>
+      <w:proofErr w:type="spellStart"/>
+      <w:r>
+        <w:rPr>
+          <w:b/>
+          <w:bCs/>
+          <w:lang w:val="ro-RO"/>
+        </w:rPr>
+        <w:t>time</w:t>
+      </w:r>
+      <w:proofErr w:type="spellEnd"/>
+      <w:r>
+        <w:rPr>
+          <w:b/>
+          <w:bCs/>
+          <w:lang w:val="ro-RO"/>
+        </w:rPr>
+        <w:t xml:space="preserve"> pe S32K3: </w:t>
+      </w:r>
+      <w:r>
+        <w:rPr>
+          <w:lang w:val="ro-RO"/>
+        </w:rPr>
+        <w:t>SENSE-DETECT-PREDICT-SUPERVI</w:t>
+      </w:r>
+      <w:r>
+        <w:rPr>
+          <w:lang w:val="ro-RO"/>
+        </w:rPr>
+        <w:t>S</w:t>
+      </w:r>
+      <w:r>
+        <w:rPr>
+          <w:lang w:val="ro-RO"/>
+        </w:rPr>
+        <w:t>OR-ACT, cu supervizorul determinist ca poartă de veto.</w:t>
       </w:r>
     </w:p>
     <w:p>
@@ -779,13 +1284,23 @@
           <w:lang w:val="ro-RO"/>
         </w:rPr>
       </w:pPr>
-      <w:r>
-        <w:rPr>
-          <w:b/>
-          <w:bCs/>
-          <w:lang w:val="ro-RO"/>
-        </w:rPr>
-        <w:t xml:space="preserve">Pipeline-ul de agenți AI </w:t>
+      <w:proofErr w:type="spellStart"/>
+      <w:r>
+        <w:rPr>
+          <w:b/>
+          <w:bCs/>
+          <w:lang w:val="ro-RO"/>
+        </w:rPr>
+        <w:t>Pipeline-ul</w:t>
+      </w:r>
+      <w:proofErr w:type="spellEnd"/>
+      <w:r>
+        <w:rPr>
+          <w:b/>
+          <w:bCs/>
+          <w:lang w:val="ro-RO"/>
+        </w:rPr>
+        <w:t xml:space="preserve"> de agenți AI </w:t>
       </w:r>
       <w:r>
         <w:rPr>
@@ -811,13 +1326,59 @@
           <w:bCs/>
           <w:lang w:val="ro-RO"/>
         </w:rPr>
-        <w:t xml:space="preserve">Arhitectura backbone-ului de date </w:t>
-      </w:r>
-      <w:r>
-        <w:rPr>
-          <w:lang w:val="ro-RO"/>
-        </w:rPr>
-        <w:t>off-vehicle pe Railway.</w:t>
+        <w:t xml:space="preserve">Arhitectura </w:t>
+      </w:r>
+      <w:proofErr w:type="spellStart"/>
+      <w:r>
+        <w:rPr>
+          <w:b/>
+          <w:bCs/>
+          <w:lang w:val="ro-RO"/>
+        </w:rPr>
+        <w:t>backbone</w:t>
+      </w:r>
+      <w:proofErr w:type="spellEnd"/>
+      <w:r>
+        <w:rPr>
+          <w:b/>
+          <w:bCs/>
+          <w:lang w:val="ro-RO"/>
+        </w:rPr>
+        <w:t xml:space="preserve">-ului de date </w:t>
+      </w:r>
+      <w:r>
+        <w:rPr>
+          <w:lang w:val="ro-RO"/>
+        </w:rPr>
+        <w:t>off-</w:t>
+      </w:r>
+      <w:proofErr w:type="spellStart"/>
+      <w:r>
+        <w:rPr>
+          <w:lang w:val="ro-RO"/>
+        </w:rPr>
+        <w:t>vehicle</w:t>
+      </w:r>
+      <w:proofErr w:type="spellEnd"/>
+      <w:r>
+        <w:rPr>
+          <w:lang w:val="ro-RO"/>
+        </w:rPr>
+        <w:t xml:space="preserve"> pe </w:t>
+      </w:r>
+      <w:proofErr w:type="spellStart"/>
+      <w:r>
+        <w:rPr>
+          <w:lang w:val="ro-RO"/>
+        </w:rPr>
+        <w:t>Railway</w:t>
+      </w:r>
+      <w:proofErr w:type="spellEnd"/>
+      <w:r>
+        <w:rPr>
+          <w:lang w:val="ro-RO"/>
+        </w:rPr>
+        <w:t>.</w:t>
       </w:r>
     </w:p>
     <w:p>
@@ -831,13 +1392,59 @@
           <w:lang w:val="ro-RO"/>
         </w:rPr>
       </w:pPr>
-      <w:r>
-        <w:rPr>
-          <w:b/>
-          <w:bCs/>
-          <w:lang w:val="ro-RO"/>
-        </w:rPr>
-        <w:t xml:space="preserve">Use case și sequence diagram </w:t>
+      <w:proofErr w:type="spellStart"/>
+      <w:r>
+        <w:rPr>
+          <w:b/>
+          <w:bCs/>
+          <w:lang w:val="ro-RO"/>
+        </w:rPr>
+        <w:t>Use</w:t>
+      </w:r>
+      <w:proofErr w:type="spellEnd"/>
+      <w:r>
+        <w:rPr>
+          <w:b/>
+          <w:bCs/>
+          <w:lang w:val="ro-RO"/>
+        </w:rPr>
+        <w:t xml:space="preserve"> case și </w:t>
+      </w:r>
+      <w:proofErr w:type="spellStart"/>
+      <w:r>
+        <w:rPr>
+          <w:b/>
+          <w:bCs/>
+          <w:lang w:val="ro-RO"/>
+        </w:rPr>
+        <w:t>sequence</w:t>
+      </w:r>
+      <w:proofErr w:type="spellEnd"/>
+      <w:r>
+        <w:rPr>
+          <w:b/>
+          <w:bCs/>
+          <w:lang w:val="ro-RO"/>
+        </w:rPr>
+        <w:t xml:space="preserve"> </w:t>
+      </w:r>
+      <w:proofErr w:type="spellStart"/>
+      <w:r>
+        <w:rPr>
+          <w:b/>
+          <w:bCs/>
+          <w:lang w:val="ro-RO"/>
+        </w:rPr>
+        <w:t>diagram</w:t>
+      </w:r>
+      <w:proofErr w:type="spellEnd"/>
+      <w:r>
+        <w:rPr>
+          <w:b/>
+          <w:bCs/>
+          <w:lang w:val="ro-RO"/>
+        </w:rPr>
+        <w:t xml:space="preserve"> </w:t>
       </w:r>
       <w:r>
         <w:rPr>
@@ -854,8 +1461,39 @@
           <w:sz w:val="22"/>
           <w:szCs w:val="22"/>
         </w:rPr>
-        <w:t>6. Consultaţii pentru proiect (săptămânal): 2x 2h/saptamana</w:t>
-      </w:r>
+        <w:t xml:space="preserve">6. </w:t>
+      </w:r>
+      <w:proofErr w:type="spellStart"/>
+      <w:r>
+        <w:rPr>
+          <w:b/>
+          <w:bCs/>
+          <w:sz w:val="22"/>
+          <w:szCs w:val="22"/>
+        </w:rPr>
+        <w:t>Consultaţii</w:t>
+      </w:r>
+      <w:proofErr w:type="spellEnd"/>
+      <w:r>
+        <w:rPr>
+          <w:b/>
+          <w:bCs/>
+          <w:sz w:val="22"/>
+          <w:szCs w:val="22"/>
+        </w:rPr>
+        <w:t xml:space="preserve"> pentru proiect (săptămânal): 2x 2h/</w:t>
+      </w:r>
+      <w:proofErr w:type="spellStart"/>
+      <w:r>
+        <w:rPr>
+          <w:b/>
+          <w:bCs/>
+          <w:sz w:val="22"/>
+          <w:szCs w:val="22"/>
+        </w:rPr>
+        <w:t>saptamana</w:t>
+      </w:r>
+      <w:proofErr w:type="spellEnd"/>
     </w:p>
     <w:p>
       <w:r>
@@ -1004,13 +1642,23 @@
                 <w:color w:val="auto"/>
               </w:rPr>
             </w:pPr>
+            <w:proofErr w:type="spellStart"/>
             <w:r>
               <w:rPr>
                 <w:color w:val="auto"/>
                 <w:sz w:val="19"/>
                 <w:szCs w:val="19"/>
               </w:rPr>
-              <w:t>Prof.univ.dr.ing. Adrian Florea</w:t>
+              <w:t>Prof.univ.dr.ing</w:t>
+            </w:r>
+            <w:proofErr w:type="spellEnd"/>
+            <w:r>
+              <w:rPr>
+                <w:color w:val="auto"/>
+                <w:sz w:val="19"/>
+                <w:szCs w:val="19"/>
+              </w:rPr>
+              <w:t>. Adrian Florea</w:t>
             </w:r>
           </w:p>
         </w:tc>

</xml_diff>